<commit_message>
source docs: append numbered references with hyperlinks to DOCX and PDF
Both the DOCX and PDF now carry the full "Sources and references"
section after the research notes - 18 numbered entries (two of them
split with an a/b for the double-sourced BYD Camacari and Szeged
items), each with its primary URL as a live hyperlink. The URLs
match the article's bibliography and the user's supplied list.

Co-Authored-By: Claude Opus 4.7 (1M context) <noreply@anthropic.com>
Claude-Session: https://claude.ai/code/session_01UTkcwmfvBCDVuALj2XrD2r
</commit_message>
<xml_diff>
--- a/assets/docs/china-overseas-plants-source.docx
+++ b/assets/docs/china-overseas-plants-source.docx
@@ -896,6 +896,303 @@
           <w:rtl w:val="0"/>
         </w:rPr>
       </w:r>
+    </w:p>
+    <w:p/>
+    <w:p>
+      <w:r>
+        <w:rPr>
+          <w:b/>
+        </w:rPr>
+        <w:t>Sources and references</w:t>
+      </w:r>
+    </w:p>
+    <w:p>
+      <w:r>
+        <w:rPr>
+          <w:i/>
+        </w:rPr>
+        <w:t>Every claim in the piece "China ships the factory, not just the car" (transitionslab.org/insight-china-ships-the-factory) is backed by one of the numbered sources below. Shares vary across sources depending on how "Europe" is defined and which brands are counted as Chinese.</w:t>
+      </w:r>
+    </w:p>
+    <w:p>
+      <w:r>
+        <w:t xml:space="preserve">1. BYD Rayong, Thailand — production and utilisation (Electric Vehicles): "BYD production in Thailand slows a third as plant passes 100,000 vehicles."  </w:t>
+      </w:r>
+      <w:hyperlink r:id="rId7">
+        <w:r>
+          <w:rPr>
+            <w:color w:val="1A5FFF"/>
+            <w:u w:val="single"/>
+          </w:rPr>
+          <w:t xml:space="preserve">https://eletric-vehicles.com/byd/byd-production-in-thailand-slows-a-third-as-plant-passes-100000-vehicles/</w:t>
+        </w:r>
+      </w:hyperlink>
+    </w:p>
+    <w:p>
+      <w:r>
+        <w:t xml:space="preserve">2a. BYD Camaçari, Brazil — BYD press release: "First BYD electric vehicle rolls off the line in Brazil."  </w:t>
+      </w:r>
+      <w:hyperlink r:id="rId8">
+        <w:r>
+          <w:rPr>
+            <w:color w:val="1A5FFF"/>
+            <w:u w:val="single"/>
+          </w:rPr>
+          <w:t xml:space="preserve">https://www.byd.com/us/news-list/First-BYD-Electric-Vehicle-Rolls-off-the-Line-in-Brazil</w:t>
+        </w:r>
+      </w:hyperlink>
+    </w:p>
+    <w:p>
+      <w:r>
+        <w:t xml:space="preserve">2b. BYD Camaçari, Brazil — South China Morning Post: "BYD opens massive Brazil plant, its biggest investment outside Asia."  </w:t>
+      </w:r>
+      <w:hyperlink r:id="rId9">
+        <w:r>
+          <w:rPr>
+            <w:color w:val="1A5FFF"/>
+            <w:u w:val="single"/>
+          </w:rPr>
+          <w:t xml:space="preserve">https://www.scmp.com/news/china/article/3328433/byd-opens-massive-brazil-plant-its-biggest-investment-outside-asia</w:t>
+        </w:r>
+      </w:hyperlink>
+    </w:p>
+    <w:p>
+      <w:r>
+        <w:t xml:space="preserve">3a. BYD Szeged, Hungary — IAA Mobility: "BYD launches trial production in Hungary — a milestone in European EV manufacturing."  </w:t>
+      </w:r>
+      <w:hyperlink r:id="rId10">
+        <w:r>
+          <w:rPr>
+            <w:color w:val="1A5FFF"/>
+            <w:u w:val="single"/>
+          </w:rPr>
+          <w:t xml:space="preserve">https://www.iaa-mobility.com/en/newsroom/news/future-technology/byd-launches-trial-production-hungary-milestone-european-ev-manufacturing</w:t>
+        </w:r>
+      </w:hyperlink>
+    </w:p>
+    <w:p>
+      <w:r>
+        <w:t xml:space="preserve">3b. BYD Szeged, Hungary — Sustainable Bus: "Batteries and chassis: BYD builds factories in Hungary and Brazil."  </w:t>
+      </w:r>
+      <w:hyperlink r:id="rId11">
+        <w:r>
+          <w:rPr>
+            <w:color w:val="1A5FFF"/>
+            <w:u w:val="single"/>
+          </w:rPr>
+          <w:t xml:space="preserve">https://www.sustainable-bus.com/components/batteries-and-chassis-byd-builds-factories-in-hungary-and-brazil/</w:t>
+        </w:r>
+      </w:hyperlink>
+    </w:p>
+    <w:p>
+      <w:r>
+        <w:t xml:space="preserve">4. Great Wall Motor Rayong, Thailand — China Daily: June 2021 inauguration on the former GM Rayong site.  </w:t>
+      </w:r>
+      <w:hyperlink r:id="rId12">
+        <w:r>
+          <w:rPr>
+            <w:color w:val="1A5FFF"/>
+            <w:u w:val="single"/>
+          </w:rPr>
+          <w:t xml:space="preserve">https://global.chinadaily.com.cn/a/202106/10/WS60c16e96a31024ad0bac4c86.html</w:t>
+        </w:r>
+      </w:hyperlink>
+    </w:p>
+    <w:p>
+      <w:r>
+        <w:t xml:space="preserve">5. Great Wall Motor Iracemápolis, Brazil — CnEVPost: "GWM Brazil plant begins production" (16 August 2025).  </w:t>
+      </w:r>
+      <w:hyperlink r:id="rId13">
+        <w:r>
+          <w:rPr>
+            <w:color w:val="1A5FFF"/>
+            <w:u w:val="single"/>
+          </w:rPr>
+          <w:t xml:space="preserve">https://cnevpost.com/2025/08/16/gwm-brazil-plant-begins-production/</w:t>
+        </w:r>
+      </w:hyperlink>
+    </w:p>
+    <w:p>
+      <w:r>
+        <w:t xml:space="preserve">6. BYD Manisa, Turkey — Intellinews: "Chinese electric vehicle maker BYD signs agreement to build $1bn production plant in Turkey." Project subsequently on hold.  </w:t>
+      </w:r>
+      <w:hyperlink r:id="rId14">
+        <w:r>
+          <w:rPr>
+            <w:color w:val="1A5FFF"/>
+            <w:u w:val="single"/>
+          </w:rPr>
+          <w:t xml:space="preserve">https://www.intellinews.com/chinese-electric-vehicle-maker-byd-signs-agreement-to-build-1bn-production-plant-in-turkey-332992/</w:t>
+        </w:r>
+      </w:hyperlink>
+    </w:p>
+    <w:p>
+      <w:r>
+        <w:t xml:space="preserve">7. Chery Lembah Beringin, Malaysia — CarList.my: "Largest in Malaysia: construction of RM 2.2 bil Chery City in Lembah Beringin reaches new milestone, on track for 2027 completion."  </w:t>
+      </w:r>
+      <w:hyperlink r:id="rId15">
+        <w:r>
+          <w:rPr>
+            <w:color w:val="1A5FFF"/>
+            <w:u w:val="single"/>
+          </w:rPr>
+          <w:t xml:space="preserve">https://www.carlist.my/zh/news/largest-in-malaysia-construction-of-rm-2-2-bil-chery-city-in-lembah-beringin-reaches-new-milestone-on-track-for-2027-completion-150195/150195/</w:t>
+        </w:r>
+      </w:hyperlink>
+    </w:p>
+    <w:p>
+      <w:r>
+        <w:t xml:space="preserve">8. Chery Barcelona (Ebro JV) — BusinessDay: "China's Chery to emulate Toyota and Tesla in global pursuit" (28 April 2026).  </w:t>
+      </w:r>
+      <w:hyperlink r:id="rId16">
+        <w:r>
+          <w:rPr>
+            <w:color w:val="1A5FFF"/>
+            <w:u w:val="single"/>
+          </w:rPr>
+          <w:t xml:space="preserve">https://www.businessday.co.za/motoring/2026-04-28-chinas-chery-to-emulate-toyota-and-tesla-in-global-pursuit/</w:t>
+        </w:r>
+      </w:hyperlink>
+    </w:p>
+    <w:p>
+      <w:r>
+        <w:t xml:space="preserve">9. Geely–Renault Brasil, São José dos Pinhais — CnEVPost: "Geely deal to take 26.4% stake in Renault Brazil" (3 November 2025).  </w:t>
+      </w:r>
+      <w:hyperlink r:id="rId17">
+        <w:r>
+          <w:rPr>
+            <w:color w:val="1A5FFF"/>
+            <w:u w:val="single"/>
+          </w:rPr>
+          <w:t xml:space="preserve">https://cnevpost.com/2025/11/03/geely-deal-take-26-4-stake-renault-brazil/</w:t>
+        </w:r>
+      </w:hyperlink>
+    </w:p>
+    <w:p>
+      <w:r>
+        <w:t xml:space="preserve">10. Europe market share, March 2026 — PwC Autofacts Market Update, March 2026, page 3 (Chinese-brand share crosses 4% in Europe). Shares vary across sources depending on how "Europe" is defined and which brands count as Chinese (MG, Polestar, Volvo).  </w:t>
+      </w:r>
+      <w:hyperlink r:id="rId18">
+        <w:r>
+          <w:rPr>
+            <w:color w:val="1A5FFF"/>
+            <w:u w:val="single"/>
+          </w:rPr>
+          <w:t xml:space="preserve">https://www.pwc.com/vn/en/publications/2026/autofacts-market-update-march-2026.pdf</w:t>
+        </w:r>
+      </w:hyperlink>
+    </w:p>
+    <w:p>
+      <w:r>
+        <w:t xml:space="preserve">11. Brazil market share, 2026 — Gasgoo Auto News: "Brazil's passenger-vehicle market in June — Chinese brands' share rises to 23.3%; BYD ranks fourth overall." Companion to ANFAVEA's 2026 monthly bulletin series (electrified-vehicle share 25.2%).  </w:t>
+      </w:r>
+      <w:hyperlink r:id="rId19">
+        <w:r>
+          <w:rPr>
+            <w:color w:val="1A5FFF"/>
+            <w:u w:val="single"/>
+          </w:rPr>
+          <w:t xml:space="preserve">https://autonews.gasgoo.com/articles/market-industry/brazils-passenger-vehicle-market-in-june-chinese-brands-share-rises-to-233-byd-ranks-fourth-overall-2083132446781448193</w:t>
+        </w:r>
+      </w:hyperlink>
+    </w:p>
+    <w:p>
+      <w:r>
+        <w:t xml:space="preserve">12. ASEAN-6 market share, H1 2026 — PwC: "Overview of the ASEAN-6 Automotive Market Snapshot, 6th edition." Chinese OEMs reach ~15.7% of the ASEAN-6 passenger-car market.  </w:t>
+      </w:r>
+      <w:hyperlink r:id="rId20">
+        <w:r>
+          <w:rPr>
+            <w:color w:val="1A5FFF"/>
+            <w:u w:val="single"/>
+          </w:rPr>
+          <w:t xml:space="preserve">https://www.pwc.com/my/en/publications/2026/overview-of-the-asean-6-automotive-6th-market-snapshot.html</w:t>
+        </w:r>
+      </w:hyperlink>
+    </w:p>
+    <w:p>
+      <w:r>
+        <w:t xml:space="preserve">13. IEA — Global Critical Minerals Outlook 2026. LFP cathode manufacturing concentration (around 95% in China) and refined-metal processing shares.  </w:t>
+      </w:r>
+      <w:hyperlink r:id="rId21">
+        <w:r>
+          <w:rPr>
+            <w:color w:val="1A5FFF"/>
+            <w:u w:val="single"/>
+          </w:rPr>
+          <w:t xml:space="preserve">https://www.iea.org/reports/global-critical-minerals-outlook-2026</w:t>
+        </w:r>
+      </w:hyperlink>
+    </w:p>
+    <w:p>
+      <w:r>
+        <w:t xml:space="preserve">14. Benchmark Mineral Intelligence — Lithium-ion Battery Database and LFP Cathode Tracker series.  </w:t>
+      </w:r>
+      <w:hyperlink r:id="rId22">
+        <w:r>
+          <w:rPr>
+            <w:color w:val="1A5FFF"/>
+            <w:u w:val="single"/>
+          </w:rPr>
+          <w:t xml:space="preserve">https://source.benchmarkminerals.com/</w:t>
+        </w:r>
+      </w:hyperlink>
+    </w:p>
+    <w:p>
+      <w:r>
+        <w:t xml:space="preserve">15. ACEA — European Automobile Manufacturers' Association passenger-car registrations (companion to the PwC Autofacts reading, for the underlying monthly release).  </w:t>
+      </w:r>
+      <w:hyperlink r:id="rId23">
+        <w:r>
+          <w:rPr>
+            <w:color w:val="1A5FFF"/>
+            <w:u w:val="single"/>
+          </w:rPr>
+          <w:t xml:space="preserve">https://www.acea.auto/pc-registrations/</w:t>
+        </w:r>
+      </w:hyperlink>
+    </w:p>
+    <w:p>
+      <w:r>
+        <w:t xml:space="preserve">16. ANFAVEA — Brazilian automotive association. Monthly bulletin series, 2026.  </w:t>
+      </w:r>
+      <w:hyperlink r:id="rId24">
+        <w:r>
+          <w:rPr>
+            <w:color w:val="1A5FFF"/>
+            <w:u w:val="single"/>
+          </w:rPr>
+          <w:t xml:space="preserve">https://anfavea.com.br/site/edicoes-carta-da-anfavea/</w:t>
+        </w:r>
+      </w:hyperlink>
+    </w:p>
+    <w:p>
+      <w:r>
+        <w:t xml:space="preserve">17. ASEAN Automotive Federation — regional sales statistics.  </w:t>
+      </w:r>
+      <w:hyperlink r:id="rId25">
+        <w:r>
+          <w:rPr>
+            <w:color w:val="1A5FFF"/>
+            <w:u w:val="single"/>
+          </w:rPr>
+          <w:t xml:space="preserve">https://www.asean-autofed.com/statistics.html</w:t>
+        </w:r>
+      </w:hyperlink>
+    </w:p>
+    <w:p>
+      <w:r>
+        <w:t xml:space="preserve">18. Volvo Cars (Geely subsidiary) — Volvo Cars Annual Report 2024, manufacturing footprint and installed capacity at Torslanda, Ghent and Ridgeville.  </w:t>
+      </w:r>
+      <w:hyperlink r:id="rId26">
+        <w:r>
+          <w:rPr>
+            <w:color w:val="1A5FFF"/>
+            <w:u w:val="single"/>
+          </w:rPr>
+          <w:t xml:space="preserve">https://investors.volvocars.com/en/</w:t>
+        </w:r>
+      </w:hyperlink>
     </w:p>
     <w:sectPr>
       <w:pgSz w:h="16834" w:w="11909" w:orient="portrait"/>

</xml_diff>